<commit_message>
Lab14 : correction du rapport.md et documents finaux
</commit_message>
<xml_diff>
--- a/lab14/rapport.docx
+++ b/lab14/rapport.docx
@@ -2,25 +2,112 @@
 <file path=word/document.xml><?xml version="1.0" encoding="utf-8"?>
 <w:document xmlns:w="http://schemas.openxmlformats.org/wordprocessingml/2006/main" xmlns:m="http://schemas.openxmlformats.org/officeDocument/2006/math" xmlns:r="http://schemas.openxmlformats.org/officeDocument/2006/relationships" xmlns:o="urn:schemas-microsoft-com:office:office" xmlns:v="urn:schemas-microsoft-com:vml" xmlns:w10="urn:schemas-microsoft-com:office:word" xmlns:a="http://schemas.openxmlformats.org/drawingml/2006/main" xmlns:pic="http://schemas.openxmlformats.org/drawingml/2006/picture" xmlns:wp="http://schemas.openxmlformats.org/drawingml/2006/wordprocessingDrawing">
   <w:body>
-    <w:bookmarkStart w:id="20" w:name="cat-rapport.md-eof"/>
-    <w:p>
-      <w:pPr>
-        <w:pStyle w:val="Heading2"/>
-      </w:pPr>
-      <w:r>
-        <w:t xml:space="preserve">cat &gt; rapport.md &lt;&lt;</w:t>
-      </w:r>
-      <w:r>
-        <w:t xml:space="preserve"> </w:t>
-      </w:r>
-      <w:r>
-        <w:t xml:space="preserve">‘</w:t>
-      </w:r>
-      <w:r>
-        <w:t xml:space="preserve">EOF</w:t>
-      </w:r>
-      <w:r>
-        <w:t xml:space="preserve">’</w:t>
+    <w:p>
+      <w:pPr>
+        <w:pStyle w:val="Title"/>
+      </w:pPr>
+      <w:r>
+        <w:t xml:space="preserve">Лабораторная</w:t>
+      </w:r>
+      <w:r>
+        <w:t xml:space="preserve"> </w:t>
+      </w:r>
+      <w:r>
+        <w:t xml:space="preserve">работа</w:t>
+      </w:r>
+      <w:r>
+        <w:t xml:space="preserve"> </w:t>
+      </w:r>
+      <w:r>
+        <w:t xml:space="preserve">№14:</w:t>
+      </w:r>
+      <w:r>
+        <w:t xml:space="preserve"> </w:t>
+      </w:r>
+      <w:r>
+        <w:t xml:space="preserve">Программирование</w:t>
+      </w:r>
+      <w:r>
+        <w:t xml:space="preserve"> </w:t>
+      </w:r>
+      <w:r>
+        <w:t xml:space="preserve">в</w:t>
+      </w:r>
+      <w:r>
+        <w:t xml:space="preserve"> </w:t>
+      </w:r>
+      <w:r>
+        <w:t xml:space="preserve">командном</w:t>
+      </w:r>
+      <w:r>
+        <w:t xml:space="preserve"> </w:t>
+      </w:r>
+      <w:r>
+        <w:t xml:space="preserve">процессоре</w:t>
+      </w:r>
+      <w:r>
+        <w:t xml:space="preserve"> </w:t>
+      </w:r>
+      <w:r>
+        <w:t xml:space="preserve">ОС</w:t>
+      </w:r>
+      <w:r>
+        <w:t xml:space="preserve"> </w:t>
+      </w:r>
+      <w:r>
+        <w:t xml:space="preserve">UNIX.</w:t>
+      </w:r>
+      <w:r>
+        <w:t xml:space="preserve"> </w:t>
+      </w:r>
+      <w:r>
+        <w:t xml:space="preserve">Продвинутое</w:t>
+      </w:r>
+      <w:r>
+        <w:t xml:space="preserve"> </w:t>
+      </w:r>
+      <w:r>
+        <w:t xml:space="preserve">использование</w:t>
+      </w:r>
+    </w:p>
+    <w:p>
+      <w:pPr>
+        <w:pStyle w:val="Author"/>
+      </w:pPr>
+      <w:r>
+        <w:t xml:space="preserve">LISSOM</w:t>
+      </w:r>
+      <w:r>
+        <w:t xml:space="preserve"> </w:t>
+      </w:r>
+      <w:r>
+        <w:t xml:space="preserve">BAYEM</w:t>
+      </w:r>
+      <w:r>
+        <w:t xml:space="preserve"> </w:t>
+      </w:r>
+      <w:r>
+        <w:t xml:space="preserve">ODILLON</w:t>
+      </w:r>
+      <w:r>
+        <w:t xml:space="preserve"> </w:t>
+      </w:r>
+      <w:r>
+        <w:t xml:space="preserve">NATHANAEL</w:t>
+      </w:r>
+    </w:p>
+    <w:p>
+      <w:pPr>
+        <w:pStyle w:val="Date"/>
+      </w:pPr>
+    </w:p>
+    <w:bookmarkStart w:id="20" w:name="цель-работы"/>
+    <w:p>
+      <w:pPr>
+        <w:pStyle w:val="Heading1"/>
+      </w:pPr>
+      <w:r>
+        <w:t xml:space="preserve">1. Цель работы</w:t>
       </w:r>
     </w:p>
     <w:p>
@@ -28,74 +115,11 @@
         <w:pStyle w:val="FirstParagraph"/>
       </w:pPr>
       <w:r>
-        <w:t xml:space="preserve">title:</w:t>
-      </w:r>
-      <w:r>
-        <w:t xml:space="preserve"> </w:t>
-      </w:r>
-      <w:r>
-        <w:t xml:space="preserve">“</w:t>
-      </w:r>
-      <w:r>
-        <w:t xml:space="preserve">Лабораторная работа №14: Программирование в командном процессоре ОС UNIX. Продвинутое использование</w:t>
-      </w:r>
-      <w:r>
-        <w:t xml:space="preserve">”</w:t>
-      </w:r>
-      <w:r>
-        <w:t xml:space="preserve"> </w:t>
-      </w:r>
-      <w:r>
-        <w:t xml:space="preserve">author:</w:t>
-      </w:r>
-      <w:r>
-        <w:t xml:space="preserve"> </w:t>
-      </w:r>
-      <w:r>
-        <w:t xml:space="preserve">“</w:t>
-      </w:r>
-      <w:r>
-        <w:t xml:space="preserve">LISSOM BAYEM ODILLON NATHANAEL</w:t>
-      </w:r>
-      <w:r>
-        <w:t xml:space="preserve">”</w:t>
-      </w:r>
-      <w:r>
-        <w:t xml:space="preserve"> </w:t>
-      </w:r>
-      <w:r>
-        <w:t xml:space="preserve">date:</w:t>
-      </w:r>
-      <w:r>
-        <w:t xml:space="preserve"> </w:t>
-      </w:r>
-      <w:r>
-        <w:t xml:space="preserve"> </w:t>
-      </w:r>
-      <w:r>
-        <w:t xml:space="preserve">—</w:t>
+        <w:t xml:space="preserve">Изучить основы программирования в оболочке ОС UNIX. Научиться писать более сложные командные файлы с использованием логических управляющих конструкций и циклов, семафоров, обработки аргументов, генерации случайных чисел.</w:t>
       </w:r>
     </w:p>
     <w:bookmarkEnd w:id="20"/>
-    <w:bookmarkStart w:id="21" w:name="цель-работы"/>
-    <w:p>
-      <w:pPr>
-        <w:pStyle w:val="Heading1"/>
-      </w:pPr>
-      <w:r>
-        <w:t xml:space="preserve">1. Цель работы</w:t>
-      </w:r>
-    </w:p>
-    <w:p>
-      <w:pPr>
-        <w:pStyle w:val="FirstParagraph"/>
-      </w:pPr>
-      <w:r>
-        <w:t xml:space="preserve">Изучить основы программирования в оболочке ОС UNIX. Научиться писать более сложные командные файлы с использованием логических управляющих конструкций и циклов, семафоров, обработки аргументов, генерации случайных чисел.</w:t>
-      </w:r>
-    </w:p>
-    <w:bookmarkEnd w:id="21"/>
-    <w:bookmarkStart w:id="22" w:name="задание"/>
+    <w:bookmarkStart w:id="21" w:name="задание"/>
     <w:p>
       <w:pPr>
         <w:pStyle w:val="Heading1"/>
@@ -176,8 +200,8 @@
         <w:t xml:space="preserve">.</w:t>
       </w:r>
     </w:p>
-    <w:bookmarkEnd w:id="22"/>
-    <w:bookmarkStart w:id="44" w:name="выполнение-лабораторной-работы"/>
+    <w:bookmarkEnd w:id="21"/>
+    <w:bookmarkStart w:id="43" w:name="выполнение-лабораторной-работы"/>
     <w:p>
       <w:pPr>
         <w:pStyle w:val="Heading1"/>
@@ -186,7 +210,7 @@
         <w:t xml:space="preserve">3. Выполнение лабораторной работы</w:t>
       </w:r>
     </w:p>
-    <w:bookmarkStart w:id="29" w:name="семафоры"/>
+    <w:bookmarkStart w:id="28" w:name="семафоры"/>
     <w:p>
       <w:pPr>
         <w:pStyle w:val="Heading2"/>
@@ -224,18 +248,18 @@
           <wp:inline>
             <wp:extent cx="5334000" cy="4973283"/>
             <wp:effectExtent b="0" l="0" r="0" t="0"/>
-            <wp:docPr descr="Код semaphore.sh" title="" id="24" name="Picture"/>
+            <wp:docPr descr="Код semaphore.sh" title="" id="23" name="Picture"/>
             <a:graphic>
               <a:graphicData uri="http://schemas.openxmlformats.org/drawingml/2006/picture">
                 <pic:pic>
                   <pic:nvPicPr>
-                    <pic:cNvPr descr="images/semaphore_sh_content.png" id="25" name="Picture"/>
+                    <pic:cNvPr descr="images/semaphore_sh_content.png" id="24" name="Picture"/>
                     <pic:cNvPicPr>
                       <a:picLocks noChangeArrowheads="1" noChangeAspect="1"/>
                     </pic:cNvPicPr>
                   </pic:nvPicPr>
                   <pic:blipFill>
-                    <a:blip r:embed="rId23"/>
+                    <a:blip r:embed="rId22"/>
                     <a:stretch>
                       <a:fillRect/>
                     </a:stretch>
@@ -287,18 +311,18 @@
           <wp:inline>
             <wp:extent cx="5334000" cy="1268044"/>
             <wp:effectExtent b="0" l="0" r="0" t="0"/>
-            <wp:docPr descr="Запуск семафора" title="" id="27" name="Picture"/>
+            <wp:docPr descr="Запуск семафора" title="" id="26" name="Picture"/>
             <a:graphic>
               <a:graphicData uri="http://schemas.openxmlformats.org/drawingml/2006/picture">
                 <pic:pic>
                   <pic:nvPicPr>
-                    <pic:cNvPr descr="images/semaphore_run.png" id="28" name="Picture"/>
+                    <pic:cNvPr descr="images/semaphore_run.png" id="27" name="Picture"/>
                     <pic:cNvPicPr>
                       <a:picLocks noChangeArrowheads="1" noChangeAspect="1"/>
                     </pic:cNvPicPr>
                   </pic:nvPicPr>
                   <pic:blipFill>
-                    <a:blip r:embed="rId26"/>
+                    <a:blip r:embed="rId25"/>
                     <a:stretch>
                       <a:fillRect/>
                     </a:stretch>
@@ -333,8 +357,8 @@
         <w:t xml:space="preserve">Запуск семафора</w:t>
       </w:r>
     </w:p>
-    <w:bookmarkEnd w:id="29"/>
-    <w:bookmarkStart w:id="36" w:name="аналог-man"/>
+    <w:bookmarkEnd w:id="28"/>
+    <w:bookmarkStart w:id="35" w:name="аналог-man"/>
     <w:p>
       <w:pPr>
         <w:pStyle w:val="Heading2"/>
@@ -378,18 +402,18 @@
           <wp:inline>
             <wp:extent cx="5334000" cy="2025394"/>
             <wp:effectExtent b="0" l="0" r="0" t="0"/>
-            <wp:docPr descr="Код myman.sh" title="" id="31" name="Picture"/>
+            <wp:docPr descr="Код myman.sh" title="" id="30" name="Picture"/>
             <a:graphic>
               <a:graphicData uri="http://schemas.openxmlformats.org/drawingml/2006/picture">
                 <pic:pic>
                   <pic:nvPicPr>
-                    <pic:cNvPr descr="images/myman_sh_content.png" id="32" name="Picture"/>
+                    <pic:cNvPr descr="images/myman_sh_content.png" id="31" name="Picture"/>
                     <pic:cNvPicPr>
                       <a:picLocks noChangeArrowheads="1" noChangeAspect="1"/>
                     </pic:cNvPicPr>
                   </pic:nvPicPr>
                   <pic:blipFill>
-                    <a:blip r:embed="rId30"/>
+                    <a:blip r:embed="rId29"/>
                     <a:stretch>
                       <a:fillRect/>
                     </a:stretch>
@@ -450,18 +474,18 @@
           <wp:inline>
             <wp:extent cx="5334000" cy="4123972"/>
             <wp:effectExtent b="0" l="0" r="0" t="0"/>
-            <wp:docPr descr="myman.sh пример" title="" id="34" name="Picture"/>
+            <wp:docPr descr="myman.sh пример" title="" id="33" name="Picture"/>
             <a:graphic>
               <a:graphicData uri="http://schemas.openxmlformats.org/drawingml/2006/picture">
                 <pic:pic>
                   <pic:nvPicPr>
-                    <pic:cNvPr descr="images/myman_run.png" id="35" name="Picture"/>
+                    <pic:cNvPr descr="images/myman_run.png" id="34" name="Picture"/>
                     <pic:cNvPicPr>
                       <a:picLocks noChangeArrowheads="1" noChangeAspect="1"/>
                     </pic:cNvPicPr>
                   </pic:nvPicPr>
                   <pic:blipFill>
-                    <a:blip r:embed="rId33"/>
+                    <a:blip r:embed="rId32"/>
                     <a:stretch>
                       <a:fillRect/>
                     </a:stretch>
@@ -496,8 +520,8 @@
         <w:t xml:space="preserve">myman.sh пример</w:t>
       </w:r>
     </w:p>
-    <w:bookmarkEnd w:id="36"/>
-    <w:bookmarkStart w:id="43" w:name="генерация-случайных-букв"/>
+    <w:bookmarkEnd w:id="35"/>
+    <w:bookmarkStart w:id="42" w:name="генерация-случайных-букв"/>
     <w:p>
       <w:pPr>
         <w:pStyle w:val="Heading2"/>
@@ -532,18 +556,18 @@
           <wp:inline>
             <wp:extent cx="5334000" cy="3048000"/>
             <wp:effectExtent b="0" l="0" r="0" t="0"/>
-            <wp:docPr descr="Код random_letters.sh" title="" id="38" name="Picture"/>
+            <wp:docPr descr="Код random_letters.sh" title="" id="37" name="Picture"/>
             <a:graphic>
               <a:graphicData uri="http://schemas.openxmlformats.org/drawingml/2006/picture">
                 <pic:pic>
                   <pic:nvPicPr>
-                    <pic:cNvPr descr="images/random_letters_sh_content.png" id="39" name="Picture"/>
+                    <pic:cNvPr descr="images/random_letters_sh_content.png" id="38" name="Picture"/>
                     <pic:cNvPicPr>
                       <a:picLocks noChangeArrowheads="1" noChangeAspect="1"/>
                     </pic:cNvPicPr>
                   </pic:nvPicPr>
                   <pic:blipFill>
-                    <a:blip r:embed="rId37"/>
+                    <a:blip r:embed="rId36"/>
                     <a:stretch>
                       <a:fillRect/>
                     </a:stretch>
@@ -604,18 +628,18 @@
           <wp:inline>
             <wp:extent cx="5334000" cy="1026507"/>
             <wp:effectExtent b="0" l="0" r="0" t="0"/>
-            <wp:docPr descr="random_letters.sh пример" title="" id="41" name="Picture"/>
+            <wp:docPr descr="random_letters.sh пример" title="" id="40" name="Picture"/>
             <a:graphic>
               <a:graphicData uri="http://schemas.openxmlformats.org/drawingml/2006/picture">
                 <pic:pic>
                   <pic:nvPicPr>
-                    <pic:cNvPr descr="images/random_letters_run.png" id="42" name="Picture"/>
+                    <pic:cNvPr descr="images/random_letters_run.png" id="41" name="Picture"/>
                     <pic:cNvPicPr>
                       <a:picLocks noChangeArrowheads="1" noChangeAspect="1"/>
                     </pic:cNvPicPr>
                   </pic:nvPicPr>
                   <pic:blipFill>
-                    <a:blip r:embed="rId40"/>
+                    <a:blip r:embed="rId39"/>
                     <a:stretch>
                       <a:fillRect/>
                     </a:stretch>
@@ -650,48 +674,48 @@
         <w:t xml:space="preserve">random_letters.sh пример</w:t>
       </w:r>
     </w:p>
+    <w:bookmarkEnd w:id="42"/>
     <w:bookmarkEnd w:id="43"/>
+    <w:bookmarkStart w:id="44" w:name="выводы"/>
+    <w:p>
+      <w:pPr>
+        <w:pStyle w:val="Heading1"/>
+      </w:pPr>
+      <w:r>
+        <w:t xml:space="preserve">4. Выводы</w:t>
+      </w:r>
+    </w:p>
+    <w:p>
+      <w:pPr>
+        <w:pStyle w:val="FirstParagraph"/>
+      </w:pPr>
+      <w:r>
+        <w:t xml:space="preserve">В ходе работы были освоены продвинутые техники bash : создание блокировок (семафоров), работа со сжатыми файлами (</w:t>
+      </w:r>
+      <w:r>
+        <w:rPr>
+          <w:rStyle w:val="VerbatimChar"/>
+        </w:rPr>
+        <w:t xml:space="preserve">zcat</w:t>
+      </w:r>
+      <w:r>
+        <w:t xml:space="preserve">), использование</w:t>
+      </w:r>
+      <w:r>
+        <w:t xml:space="preserve"> </w:t>
+      </w:r>
+      <w:r>
+        <w:rPr>
+          <w:rStyle w:val="VerbatimChar"/>
+        </w:rPr>
+        <w:t xml:space="preserve">$RANDOM</w:t>
+      </w:r>
+      <w:r>
+        <w:t xml:space="preserve">, конкатенация строк.</w:t>
+      </w:r>
+    </w:p>
     <w:bookmarkEnd w:id="44"/>
-    <w:bookmarkStart w:id="45" w:name="выводы"/>
-    <w:p>
-      <w:pPr>
-        <w:pStyle w:val="Heading1"/>
-      </w:pPr>
-      <w:r>
-        <w:t xml:space="preserve">4. Выводы</w:t>
-      </w:r>
-    </w:p>
-    <w:p>
-      <w:pPr>
-        <w:pStyle w:val="FirstParagraph"/>
-      </w:pPr>
-      <w:r>
-        <w:t xml:space="preserve">В ходе работы были освоены продвинутые техники bash : создание блокировок (семафоров), работа со сжатыми файлами (</w:t>
-      </w:r>
-      <w:r>
-        <w:rPr>
-          <w:rStyle w:val="VerbatimChar"/>
-        </w:rPr>
-        <w:t xml:space="preserve">zcat</w:t>
-      </w:r>
-      <w:r>
-        <w:t xml:space="preserve">), использование</w:t>
-      </w:r>
-      <w:r>
-        <w:t xml:space="preserve"> </w:t>
-      </w:r>
-      <w:r>
-        <w:rPr>
-          <w:rStyle w:val="VerbatimChar"/>
-        </w:rPr>
-        <w:t xml:space="preserve">$RANDOM</w:t>
-      </w:r>
-      <w:r>
-        <w:t xml:space="preserve">, конкатенация строк.</w:t>
-      </w:r>
-    </w:p>
-    <w:bookmarkEnd w:id="45"/>
-    <w:bookmarkStart w:id="46" w:name="ответы-на-контрольные-вопросы"/>
+    <w:bookmarkStart w:id="45" w:name="ответы-на-контрольные-вопросы"/>
     <w:p>
       <w:pPr>
         <w:pStyle w:val="Heading1"/>
@@ -955,8 +979,8 @@
         <w:t xml:space="preserve">Bash optimisé pour l’automatisation système, mais limité pour les calculs complexes ou structures de données.</w:t>
       </w:r>
     </w:p>
-    <w:bookmarkEnd w:id="46"/>
-    <w:bookmarkStart w:id="47" w:name="список-литературы"/>
+    <w:bookmarkEnd w:id="45"/>
+    <w:bookmarkStart w:id="46" w:name="список-литературы"/>
     <w:p>
       <w:pPr>
         <w:pStyle w:val="Heading1"/>
@@ -1006,14 +1030,8 @@
       <w:r>
         <w:t xml:space="preserve">.</w:t>
       </w:r>
-      <w:r>
-        <w:t xml:space="preserve"> </w:t>
-      </w:r>
-      <w:r>
-        <w:t xml:space="preserve">EOF</w:t>
-      </w:r>
-    </w:p>
-    <w:bookmarkEnd w:id="47"/>
+    </w:p>
+    <w:bookmarkEnd w:id="46"/>
     <w:sectPr/>
   </w:body>
 </w:document>

</xml_diff>